<commit_message>
Clarify participant starter categories
</commit_message>
<xml_diff>
--- a/keplerops-ai/docs/printable-guides/keplerops-participant-onboarding-guide.docx
+++ b/keplerops-ai/docs/printable-guides/keplerops-participant-onboarding-guide.docx
@@ -556,7 +556,7 @@
         <w:pStyle w:val="FirstParagraph"/>
       </w:pPr>
       <w:r>
-        <w:t xml:space="preserve">Start with an early challenge in one of these areas:</w:t>
+        <w:t xml:space="preserve">Start with an early challenge in one of these Shifter categories:</w:t>
       </w:r>
     </w:p>
     <w:p>
@@ -568,7 +568,7 @@
         <w:pStyle w:val="Compact"/>
       </w:pPr>
       <w:r>
-        <w:t xml:space="preserve">Agent Control;</w:t>
+        <w:t xml:space="preserve">AI Agent Security;</w:t>
       </w:r>
     </w:p>
     <w:p>
@@ -580,7 +580,7 @@
         <w:pStyle w:val="Compact"/>
       </w:pPr>
       <w:r>
-        <w:t xml:space="preserve">Model Evasion;</w:t>
+        <w:t xml:space="preserve">Model Security;</w:t>
       </w:r>
     </w:p>
     <w:p>
@@ -592,7 +592,7 @@
         <w:pStyle w:val="Compact"/>
       </w:pPr>
       <w:r>
-        <w:t xml:space="preserve">Context Poisoning;</w:t>
+        <w:t xml:space="preserve">Data and Retrieval;</w:t>
       </w:r>
     </w:p>
     <w:p>
@@ -604,12 +604,32 @@
         <w:pStyle w:val="Compact"/>
       </w:pPr>
       <w:r>
-        <w:t xml:space="preserve">Model Secrets.</w:t>
+        <w:t xml:space="preserve">Model Privacy.</w:t>
       </w:r>
     </w:p>
     <w:p>
       <w:pPr>
         <w:pStyle w:val="FirstParagraph"/>
+      </w:pPr>
+      <w:r>
+        <w:t xml:space="preserve">Those are the category names shown in the challenge list. If organizers call a</w:t>
+      </w:r>
+      <w:r>
+        <w:t xml:space="preserve"> </w:t>
+      </w:r>
+      <w:r>
+        <w:t xml:space="preserve">module by a different classroom name, use the category name you see in Shifter</w:t>
+      </w:r>
+      <w:r>
+        <w:t xml:space="preserve"> </w:t>
+      </w:r>
+      <w:r>
+        <w:t xml:space="preserve">when choosing the challenge.</w:t>
+      </w:r>
+    </w:p>
+    <w:p>
+      <w:pPr>
+        <w:pStyle w:val="BodyText"/>
       </w:pPr>
       <w:r>
         <w:t xml:space="preserve">Pick a challenge with no prerequisite if possible. Read the objective and the</w:t>

</xml_diff>